<commit_message>
fix(docx): isolate list state in table cells
Lists with the same numId in different table cells were incorrectly
merged. Added context manager to isolate list state during cell
processing. Includes test cases and updated ground truth files.

Signed-off-by: Cesar Berrospi Ramis <ceb@zurich.ibm.com>
</commit_message>
<xml_diff>
--- a/tests/data/docx/docx_rich_cells.docx
+++ b/tests/data/docx/docx_rich_cells.docx
@@ -318,23 +318,12 @@
         </w:tc>
       </w:tr>
     </w:tbl>
-    <w:p/>
-    <w:p/>
-    <w:p/>
-    <w:p/>
-    <w:p/>
     <w:p>
       <w:pPr>
         <w:tabs>
           <w:tab w:val="left" w:pos="2612"/>
         </w:tabs>
       </w:pPr>
-      <w:r>
-        <w:tab/>
-      </w:r>
-      <w:r>
-        <w:br w:type="textWrapping" w:clear="all"/>
-      </w:r>
     </w:p>
     <w:p>
       <w:pPr>
@@ -990,6 +979,495 @@
       </w:tr>
     </w:tbl>
     <w:p/>
+    <w:p>
+      <w:pPr>
+        <w:pStyle w:val="Heading2"/>
+      </w:pPr>
+      <w:r>
+        <w:lastRenderedPageBreak/>
+        <w:t>Lists with s</w:t>
+      </w:r>
+      <w:r>
+        <w:t xml:space="preserve">ame </w:t>
+      </w:r>
+      <w:proofErr w:type="spellStart"/>
+      <w:r>
+        <w:t>numId</w:t>
+      </w:r>
+      <w:proofErr w:type="spellEnd"/>
+      <w:r>
+        <w:t xml:space="preserve"> in different cells</w:t>
+      </w:r>
+    </w:p>
+    <w:p/>
+    <w:tbl>
+      <w:tblPr>
+        <w:tblStyle w:val="TableGrid1"/>
+        <w:tblW w:w="0" w:type="auto"/>
+        <w:tblLook w:val="04A0" w:firstRow="1" w:lastRow="0" w:firstColumn="1" w:lastColumn="0" w:noHBand="0" w:noVBand="1"/>
+      </w:tblPr>
+      <w:tblGrid>
+        <w:gridCol w:w="8640"/>
+      </w:tblGrid>
+      <w:tr>
+        <w:tc>
+          <w:tcPr>
+            <w:tcW w:w="8640" w:type="dxa"/>
+          </w:tcPr>
+          <w:p>
+            <w:pPr>
+              <w:numPr>
+                <w:ilvl w:val="0"/>
+                <w:numId w:val="7"/>
+              </w:numPr>
+              <w:rPr>
+                <w:rFonts w:ascii="Cambria" w:hAnsi="Cambria" w:cs="Times New Roman"/>
+              </w:rPr>
+            </w:pPr>
+            <w:r>
+              <w:rPr>
+                <w:rFonts w:ascii="Cambria" w:hAnsi="Cambria" w:cs="Times New Roman"/>
+              </w:rPr>
+              <w:t>Cell 1 item 1</w:t>
+            </w:r>
+          </w:p>
+          <w:p>
+            <w:pPr>
+              <w:numPr>
+                <w:ilvl w:val="0"/>
+                <w:numId w:val="7"/>
+              </w:numPr>
+              <w:rPr>
+                <w:rFonts w:ascii="Cambria" w:hAnsi="Cambria" w:cs="Times New Roman"/>
+              </w:rPr>
+            </w:pPr>
+            <w:r>
+              <w:rPr>
+                <w:rFonts w:ascii="Cambria" w:hAnsi="Cambria" w:cs="Times New Roman"/>
+              </w:rPr>
+              <w:t>Cell 1 item 2</w:t>
+            </w:r>
+          </w:p>
+        </w:tc>
+      </w:tr>
+      <w:tr>
+        <w:tc>
+          <w:tcPr>
+            <w:tcW w:w="8640" w:type="dxa"/>
+          </w:tcPr>
+          <w:p>
+            <w:pPr>
+              <w:numPr>
+                <w:ilvl w:val="0"/>
+                <w:numId w:val="7"/>
+              </w:numPr>
+              <w:rPr>
+                <w:rFonts w:ascii="Cambria" w:hAnsi="Cambria" w:cs="Times New Roman"/>
+              </w:rPr>
+            </w:pPr>
+            <w:r>
+              <w:rPr>
+                <w:rFonts w:ascii="Cambria" w:hAnsi="Cambria" w:cs="Times New Roman"/>
+              </w:rPr>
+              <w:t>Cell 2 item 1</w:t>
+            </w:r>
+          </w:p>
+          <w:p>
+            <w:pPr>
+              <w:numPr>
+                <w:ilvl w:val="0"/>
+                <w:numId w:val="7"/>
+              </w:numPr>
+              <w:rPr>
+                <w:rFonts w:ascii="Cambria" w:hAnsi="Cambria" w:cs="Times New Roman"/>
+              </w:rPr>
+            </w:pPr>
+            <w:r>
+              <w:rPr>
+                <w:rFonts w:ascii="Cambria" w:hAnsi="Cambria" w:cs="Times New Roman"/>
+              </w:rPr>
+              <w:t>Cell 2 item 2</w:t>
+            </w:r>
+          </w:p>
+        </w:tc>
+      </w:tr>
+    </w:tbl>
+    <w:p/>
+    <w:p>
+      <w:pPr>
+        <w:pStyle w:val="Heading2"/>
+      </w:pPr>
+      <w:r>
+        <w:t>Lists with d</w:t>
+      </w:r>
+      <w:r>
+        <w:t xml:space="preserve">ifferent </w:t>
+      </w:r>
+      <w:proofErr w:type="spellStart"/>
+      <w:r>
+        <w:t>numIds</w:t>
+      </w:r>
+      <w:proofErr w:type="spellEnd"/>
+      <w:r>
+        <w:t xml:space="preserve"> in different cells</w:t>
+      </w:r>
+    </w:p>
+    <w:p/>
+    <w:tbl>
+      <w:tblPr>
+        <w:tblStyle w:val="TableGrid2"/>
+        <w:tblW w:w="0" w:type="auto"/>
+        <w:tblLook w:val="04A0" w:firstRow="1" w:lastRow="0" w:firstColumn="1" w:lastColumn="0" w:noHBand="0" w:noVBand="1"/>
+      </w:tblPr>
+      <w:tblGrid>
+        <w:gridCol w:w="8640"/>
+      </w:tblGrid>
+      <w:tr>
+        <w:tc>
+          <w:tcPr>
+            <w:tcW w:w="8640" w:type="dxa"/>
+          </w:tcPr>
+          <w:p>
+            <w:pPr>
+              <w:numPr>
+                <w:ilvl w:val="0"/>
+                <w:numId w:val="7"/>
+              </w:numPr>
+              <w:rPr>
+                <w:rFonts w:ascii="Cambria" w:hAnsi="Cambria" w:cs="Times New Roman"/>
+              </w:rPr>
+            </w:pPr>
+            <w:r>
+              <w:rPr>
+                <w:rFonts w:ascii="Cambria" w:hAnsi="Cambria" w:cs="Times New Roman"/>
+              </w:rPr>
+              <w:t>Cell 1 item 1</w:t>
+            </w:r>
+          </w:p>
+          <w:p>
+            <w:pPr>
+              <w:numPr>
+                <w:ilvl w:val="0"/>
+                <w:numId w:val="7"/>
+              </w:numPr>
+              <w:rPr>
+                <w:rFonts w:ascii="Cambria" w:hAnsi="Cambria" w:cs="Times New Roman"/>
+              </w:rPr>
+            </w:pPr>
+            <w:r>
+              <w:rPr>
+                <w:rFonts w:ascii="Cambria" w:hAnsi="Cambria" w:cs="Times New Roman"/>
+              </w:rPr>
+              <w:t>Cell 1 item 2</w:t>
+            </w:r>
+          </w:p>
+        </w:tc>
+      </w:tr>
+      <w:tr>
+        <w:tc>
+          <w:tcPr>
+            <w:tcW w:w="8640" w:type="dxa"/>
+          </w:tcPr>
+          <w:p>
+            <w:pPr>
+              <w:numPr>
+                <w:ilvl w:val="0"/>
+                <w:numId w:val="8"/>
+              </w:numPr>
+              <w:rPr>
+                <w:rFonts w:ascii="Cambria" w:hAnsi="Cambria" w:cs="Times New Roman"/>
+              </w:rPr>
+            </w:pPr>
+            <w:r>
+              <w:rPr>
+                <w:rFonts w:ascii="Cambria" w:hAnsi="Cambria" w:cs="Times New Roman"/>
+              </w:rPr>
+              <w:t>Cell 2 item 1</w:t>
+            </w:r>
+          </w:p>
+          <w:p>
+            <w:pPr>
+              <w:numPr>
+                <w:ilvl w:val="0"/>
+                <w:numId w:val="8"/>
+              </w:numPr>
+              <w:rPr>
+                <w:rFonts w:ascii="Cambria" w:hAnsi="Cambria" w:cs="Times New Roman"/>
+              </w:rPr>
+            </w:pPr>
+            <w:r>
+              <w:rPr>
+                <w:rFonts w:ascii="Cambria" w:hAnsi="Cambria" w:cs="Times New Roman"/>
+              </w:rPr>
+              <w:t>Cell 2 item 2</w:t>
+            </w:r>
+          </w:p>
+        </w:tc>
+      </w:tr>
+    </w:tbl>
+    <w:p/>
+    <w:p>
+      <w:pPr>
+        <w:pStyle w:val="Heading2"/>
+      </w:pPr>
+      <w:r>
+        <w:t>Multiple columns with lists</w:t>
+      </w:r>
+    </w:p>
+    <w:p/>
+    <w:tbl>
+      <w:tblPr>
+        <w:tblStyle w:val="TableGrid3"/>
+        <w:tblW w:w="0" w:type="auto"/>
+        <w:tblLook w:val="04A0" w:firstRow="1" w:lastRow="0" w:firstColumn="1" w:lastColumn="0" w:noHBand="0" w:noVBand="1"/>
+      </w:tblPr>
+      <w:tblGrid>
+        <w:gridCol w:w="4320"/>
+        <w:gridCol w:w="4320"/>
+      </w:tblGrid>
+      <w:tr>
+        <w:tc>
+          <w:tcPr>
+            <w:tcW w:w="4320" w:type="dxa"/>
+          </w:tcPr>
+          <w:p>
+            <w:pPr>
+              <w:numPr>
+                <w:ilvl w:val="0"/>
+                <w:numId w:val="7"/>
+              </w:numPr>
+              <w:rPr>
+                <w:rFonts w:ascii="Cambria" w:hAnsi="Cambria" w:cs="Times New Roman"/>
+              </w:rPr>
+            </w:pPr>
+            <w:r>
+              <w:rPr>
+                <w:rFonts w:ascii="Cambria" w:hAnsi="Cambria" w:cs="Times New Roman"/>
+              </w:rPr>
+              <w:t>R1C1 item 1</w:t>
+            </w:r>
+          </w:p>
+          <w:p>
+            <w:pPr>
+              <w:numPr>
+                <w:ilvl w:val="0"/>
+                <w:numId w:val="7"/>
+              </w:numPr>
+              <w:rPr>
+                <w:rFonts w:ascii="Cambria" w:hAnsi="Cambria" w:cs="Times New Roman"/>
+              </w:rPr>
+            </w:pPr>
+            <w:r>
+              <w:rPr>
+                <w:rFonts w:ascii="Cambria" w:hAnsi="Cambria" w:cs="Times New Roman"/>
+              </w:rPr>
+              <w:t>R1C1 item 2</w:t>
+            </w:r>
+          </w:p>
+        </w:tc>
+        <w:tc>
+          <w:tcPr>
+            <w:tcW w:w="4320" w:type="dxa"/>
+          </w:tcPr>
+          <w:p>
+            <w:pPr>
+              <w:numPr>
+                <w:ilvl w:val="0"/>
+                <w:numId w:val="7"/>
+              </w:numPr>
+              <w:rPr>
+                <w:rFonts w:ascii="Cambria" w:hAnsi="Cambria" w:cs="Times New Roman"/>
+              </w:rPr>
+            </w:pPr>
+            <w:r>
+              <w:rPr>
+                <w:rFonts w:ascii="Cambria" w:hAnsi="Cambria" w:cs="Times New Roman"/>
+              </w:rPr>
+              <w:t>R1C2 item 1</w:t>
+            </w:r>
+          </w:p>
+          <w:p>
+            <w:pPr>
+              <w:numPr>
+                <w:ilvl w:val="0"/>
+                <w:numId w:val="7"/>
+              </w:numPr>
+              <w:rPr>
+                <w:rFonts w:ascii="Cambria" w:hAnsi="Cambria" w:cs="Times New Roman"/>
+              </w:rPr>
+            </w:pPr>
+            <w:r>
+              <w:rPr>
+                <w:rFonts w:ascii="Cambria" w:hAnsi="Cambria" w:cs="Times New Roman"/>
+              </w:rPr>
+              <w:t>R1C2 item 2</w:t>
+            </w:r>
+          </w:p>
+        </w:tc>
+      </w:tr>
+      <w:tr>
+        <w:tc>
+          <w:tcPr>
+            <w:tcW w:w="4320" w:type="dxa"/>
+          </w:tcPr>
+          <w:p>
+            <w:pPr>
+              <w:numPr>
+                <w:ilvl w:val="0"/>
+                <w:numId w:val="7"/>
+              </w:numPr>
+              <w:rPr>
+                <w:rFonts w:ascii="Cambria" w:hAnsi="Cambria" w:cs="Times New Roman"/>
+              </w:rPr>
+            </w:pPr>
+            <w:r>
+              <w:rPr>
+                <w:rFonts w:ascii="Cambria" w:hAnsi="Cambria" w:cs="Times New Roman"/>
+              </w:rPr>
+              <w:t>R2C1 item 1</w:t>
+            </w:r>
+          </w:p>
+          <w:p>
+            <w:pPr>
+              <w:numPr>
+                <w:ilvl w:val="0"/>
+                <w:numId w:val="7"/>
+              </w:numPr>
+              <w:rPr>
+                <w:rFonts w:ascii="Cambria" w:hAnsi="Cambria" w:cs="Times New Roman"/>
+              </w:rPr>
+            </w:pPr>
+            <w:r>
+              <w:rPr>
+                <w:rFonts w:ascii="Cambria" w:hAnsi="Cambria" w:cs="Times New Roman"/>
+              </w:rPr>
+              <w:t>R2C1 item 2</w:t>
+            </w:r>
+          </w:p>
+        </w:tc>
+        <w:tc>
+          <w:tcPr>
+            <w:tcW w:w="4320" w:type="dxa"/>
+          </w:tcPr>
+          <w:p>
+            <w:pPr>
+              <w:numPr>
+                <w:ilvl w:val="0"/>
+                <w:numId w:val="7"/>
+              </w:numPr>
+              <w:rPr>
+                <w:rFonts w:ascii="Cambria" w:hAnsi="Cambria" w:cs="Times New Roman"/>
+              </w:rPr>
+            </w:pPr>
+            <w:r>
+              <w:rPr>
+                <w:rFonts w:ascii="Cambria" w:hAnsi="Cambria" w:cs="Times New Roman"/>
+              </w:rPr>
+              <w:t>R2C2 item 1</w:t>
+            </w:r>
+          </w:p>
+          <w:p>
+            <w:pPr>
+              <w:numPr>
+                <w:ilvl w:val="0"/>
+                <w:numId w:val="7"/>
+              </w:numPr>
+              <w:rPr>
+                <w:rFonts w:ascii="Cambria" w:hAnsi="Cambria" w:cs="Times New Roman"/>
+              </w:rPr>
+            </w:pPr>
+            <w:r>
+              <w:rPr>
+                <w:rFonts w:ascii="Cambria" w:hAnsi="Cambria" w:cs="Times New Roman"/>
+              </w:rPr>
+              <w:t>R2C2 item 2</w:t>
+            </w:r>
+          </w:p>
+        </w:tc>
+      </w:tr>
+    </w:tbl>
+    <w:p/>
+    <w:p>
+      <w:pPr>
+        <w:pStyle w:val="Heading2"/>
+      </w:pPr>
+      <w:r>
+        <w:t>Mixed content - list and regular text in different cells</w:t>
+      </w:r>
+    </w:p>
+    <w:p/>
+    <w:tbl>
+      <w:tblPr>
+        <w:tblStyle w:val="TableGrid4"/>
+        <w:tblW w:w="0" w:type="auto"/>
+        <w:tblLook w:val="04A0" w:firstRow="1" w:lastRow="0" w:firstColumn="1" w:lastColumn="0" w:noHBand="0" w:noVBand="1"/>
+      </w:tblPr>
+      <w:tblGrid>
+        <w:gridCol w:w="8640"/>
+      </w:tblGrid>
+      <w:tr>
+        <w:tc>
+          <w:tcPr>
+            <w:tcW w:w="8640" w:type="dxa"/>
+          </w:tcPr>
+          <w:p>
+            <w:pPr>
+              <w:numPr>
+                <w:ilvl w:val="0"/>
+                <w:numId w:val="7"/>
+              </w:numPr>
+              <w:rPr>
+                <w:rFonts w:ascii="Cambria" w:hAnsi="Cambria" w:cs="Times New Roman"/>
+              </w:rPr>
+            </w:pPr>
+            <w:r>
+              <w:rPr>
+                <w:rFonts w:ascii="Cambria" w:hAnsi="Cambria" w:cs="Times New Roman"/>
+              </w:rPr>
+              <w:t>List item 1</w:t>
+            </w:r>
+          </w:p>
+          <w:p>
+            <w:pPr>
+              <w:numPr>
+                <w:ilvl w:val="0"/>
+                <w:numId w:val="7"/>
+              </w:numPr>
+              <w:rPr>
+                <w:rFonts w:ascii="Cambria" w:hAnsi="Cambria" w:cs="Times New Roman"/>
+              </w:rPr>
+            </w:pPr>
+            <w:r>
+              <w:rPr>
+                <w:rFonts w:ascii="Cambria" w:hAnsi="Cambria" w:cs="Times New Roman"/>
+              </w:rPr>
+              <w:t>List item 2</w:t>
+            </w:r>
+          </w:p>
+        </w:tc>
+      </w:tr>
+      <w:tr>
+        <w:tc>
+          <w:tcPr>
+            <w:tcW w:w="8640" w:type="dxa"/>
+          </w:tcPr>
+          <w:p>
+            <w:pPr>
+              <w:rPr>
+                <w:rFonts w:ascii="Cambria" w:hAnsi="Cambria" w:cs="Times New Roman"/>
+              </w:rPr>
+            </w:pPr>
+            <w:r>
+              <w:rPr>
+                <w:rFonts w:ascii="Cambria" w:hAnsi="Cambria" w:cs="Times New Roman"/>
+              </w:rPr>
+              <w:t>Regular text in second cell</w:t>
+            </w:r>
+          </w:p>
+        </w:tc>
+      </w:tr>
+    </w:tbl>
+    <w:p/>
     <w:sectPr>
       <w:pgSz w:w="12240" w:h="15840"/>
       <w:pgMar w:top="1440" w:right="1440" w:bottom="1440" w:left="1440" w:header="720" w:footer="720" w:gutter="0"/>
@@ -1003,6 +1481,48 @@
 <file path=word/numbering.xml><?xml version="1.0" encoding="utf-8"?>
 <w:numbering xmlns:wpc="http://schemas.microsoft.com/office/word/2010/wordprocessingCanvas" xmlns:cx="http://schemas.microsoft.com/office/drawing/2014/chartex" xmlns:cx1="http://schemas.microsoft.com/office/drawing/2015/9/8/chartex" xmlns:cx2="http://schemas.microsoft.com/office/drawing/2015/10/21/chartex" xmlns:cx3="http://schemas.microsoft.com/office/drawing/2016/5/9/chartex" xmlns:cx4="http://schemas.microsoft.com/office/drawing/2016/5/10/chartex" xmlns:cx5="http://schemas.microsoft.com/office/drawing/2016/5/11/chartex" xmlns:cx6="http://schemas.microsoft.com/office/drawing/2016/5/12/chartex" xmlns:cx7="http://schemas.microsoft.com/office/drawing/2016/5/13/chartex" xmlns:cx8="http://schemas.microsoft.com/office/drawing/2016/5/14/chartex" xmlns:mc="http://schemas.openxmlformats.org/markup-compatibility/2006" xmlns:aink="http://schemas.microsoft.com/office/drawing/2016/ink" xmlns:am3d="http://schemas.microsoft.com/office/drawing/2017/model3d" xmlns:o="urn:schemas-microsoft-com:office:office" xmlns:oel="http://schemas.microsoft.com/office/2019/extlst" xmlns:r="http://schemas.openxmlformats.org/officeDocument/2006/relationships" xmlns:m="http://schemas.openxmlformats.org/officeDocument/2006/math" xmlns:v="urn:schemas-microsoft-com:vml" xmlns:wp14="http://schemas.microsoft.com/office/word/2010/wordprocessingDrawing" xmlns:wp="http://schemas.openxmlformats.org/drawingml/2006/wordprocessingDrawing" xmlns:w10="urn:schemas-microsoft-com:office:word" xmlns:w="http://schemas.openxmlformats.org/wordprocessingml/2006/main" xmlns:w14="http://schemas.microsoft.com/office/word/2010/wordml" xmlns:w15="http://schemas.microsoft.com/office/word/2012/wordml" xmlns:w16cex="http://schemas.microsoft.com/office/word/2018/wordml/cex" xmlns:w16cid="http://schemas.microsoft.com/office/word/2016/wordml/cid" xmlns:w16="http://schemas.microsoft.com/office/word/2018/wordml" xmlns:w16du="http://schemas.microsoft.com/office/word/2023/wordml/word16du" xmlns:w16sdtdh="http://schemas.microsoft.com/office/word/2020/wordml/sdtdatahash" xmlns:w16sdtfl="http://schemas.microsoft.com/office/word/2024/wordml/sdtformatlock" xmlns:w16se="http://schemas.microsoft.com/office/word/2015/wordml/symex" xmlns:wpg="http://schemas.microsoft.com/office/word/2010/wordprocessingGroup" xmlns:wpi="http://schemas.microsoft.com/office/word/2010/wordprocessingInk" xmlns:wne="http://schemas.microsoft.com/office/word/2006/wordml" xmlns:wps="http://schemas.microsoft.com/office/word/2010/wordprocessingShape" mc:Ignorable="w14 w15 w16se w16cid w16 w16cex w16sdtdh w16sdtfl w16du wp14">
   <w:abstractNum w:abstractNumId="0" w15:restartNumberingAfterBreak="0">
+    <w:nsid w:val="FFFFFF83"/>
+    <w:multiLevelType w:val="singleLevel"/>
+    <w:tmpl w:val="3D1EFFD4"/>
+    <w:lvl w:ilvl="0">
+      <w:start w:val="1"/>
+      <w:numFmt w:val="bullet"/>
+      <w:pStyle w:val="ListBullet2"/>
+      <w:lvlText w:val=""/>
+      <w:lvlJc w:val="left"/>
+      <w:pPr>
+        <w:tabs>
+          <w:tab w:val="num" w:pos="720"/>
+        </w:tabs>
+        <w:ind w:left="720" w:hanging="360"/>
+      </w:pPr>
+      <w:rPr>
+        <w:rFonts w:ascii="Symbol" w:hAnsi="Symbol" w:hint="default"/>
+      </w:rPr>
+    </w:lvl>
+  </w:abstractNum>
+  <w:abstractNum w:abstractNumId="1" w15:restartNumberingAfterBreak="0">
+    <w:nsid w:val="FFFFFF89"/>
+    <w:multiLevelType w:val="singleLevel"/>
+    <w:tmpl w:val="29761A62"/>
+    <w:lvl w:ilvl="0">
+      <w:start w:val="1"/>
+      <w:numFmt w:val="bullet"/>
+      <w:pStyle w:val="ListBullet"/>
+      <w:lvlText w:val=""/>
+      <w:lvlJc w:val="left"/>
+      <w:pPr>
+        <w:tabs>
+          <w:tab w:val="num" w:pos="360"/>
+        </w:tabs>
+        <w:ind w:left="360" w:hanging="360"/>
+      </w:pPr>
+      <w:rPr>
+        <w:rFonts w:ascii="Symbol" w:hAnsi="Symbol" w:hint="default"/>
+      </w:rPr>
+    </w:lvl>
+  </w:abstractNum>
+  <w:abstractNum w:abstractNumId="2" w15:restartNumberingAfterBreak="0">
     <w:nsid w:val="2731336A"/>
     <w:multiLevelType w:val="hybridMultilevel"/>
     <w:tmpl w:val="2F427A9C"/>
@@ -1115,7 +1635,7 @@
       </w:rPr>
     </w:lvl>
   </w:abstractNum>
-  <w:abstractNum w:abstractNumId="1" w15:restartNumberingAfterBreak="0">
+  <w:abstractNum w:abstractNumId="3" w15:restartNumberingAfterBreak="0">
     <w:nsid w:val="2814478C"/>
     <w:multiLevelType w:val="hybridMultilevel"/>
     <w:tmpl w:val="0EECB94C"/>
@@ -1227,7 +1747,7 @@
       </w:rPr>
     </w:lvl>
   </w:abstractNum>
-  <w:abstractNum w:abstractNumId="2" w15:restartNumberingAfterBreak="0">
+  <w:abstractNum w:abstractNumId="4" w15:restartNumberingAfterBreak="0">
     <w:nsid w:val="358E4FCC"/>
     <w:multiLevelType w:val="hybridMultilevel"/>
     <w:tmpl w:val="2A8EE3D0"/>
@@ -1313,7 +1833,7 @@
       </w:pPr>
     </w:lvl>
   </w:abstractNum>
-  <w:abstractNum w:abstractNumId="3" w15:restartNumberingAfterBreak="0">
+  <w:abstractNum w:abstractNumId="5" w15:restartNumberingAfterBreak="0">
     <w:nsid w:val="37E45C6F"/>
     <w:multiLevelType w:val="hybridMultilevel"/>
     <w:tmpl w:val="BE707958"/>
@@ -1399,7 +1919,7 @@
       </w:pPr>
     </w:lvl>
   </w:abstractNum>
-  <w:abstractNum w:abstractNumId="4" w15:restartNumberingAfterBreak="0">
+  <w:abstractNum w:abstractNumId="6" w15:restartNumberingAfterBreak="0">
     <w:nsid w:val="408B516F"/>
     <w:multiLevelType w:val="hybridMultilevel"/>
     <w:tmpl w:val="9482EBC8"/>
@@ -1512,7 +2032,7 @@
       </w:rPr>
     </w:lvl>
   </w:abstractNum>
-  <w:abstractNum w:abstractNumId="5" w15:restartNumberingAfterBreak="0">
+  <w:abstractNum w:abstractNumId="7" w15:restartNumberingAfterBreak="0">
     <w:nsid w:val="51AC0023"/>
     <w:multiLevelType w:val="hybridMultilevel"/>
     <w:tmpl w:val="FD2AF1FA"/>
@@ -1626,22 +2146,28 @@
     </w:lvl>
   </w:abstractNum>
   <w:num w:numId="1" w16cid:durableId="971406578">
-    <w:abstractNumId w:val="0"/>
+    <w:abstractNumId w:val="2"/>
   </w:num>
   <w:num w:numId="2" w16cid:durableId="1254313279">
+    <w:abstractNumId w:val="3"/>
+  </w:num>
+  <w:num w:numId="3" w16cid:durableId="926963222">
+    <w:abstractNumId w:val="6"/>
+  </w:num>
+  <w:num w:numId="4" w16cid:durableId="308479267">
+    <w:abstractNumId w:val="5"/>
+  </w:num>
+  <w:num w:numId="5" w16cid:durableId="648442138">
+    <w:abstractNumId w:val="7"/>
+  </w:num>
+  <w:num w:numId="6" w16cid:durableId="666519724">
+    <w:abstractNumId w:val="4"/>
+  </w:num>
+  <w:num w:numId="7" w16cid:durableId="563956353">
     <w:abstractNumId w:val="1"/>
   </w:num>
-  <w:num w:numId="3" w16cid:durableId="926963222">
-    <w:abstractNumId w:val="4"/>
-  </w:num>
-  <w:num w:numId="4" w16cid:durableId="308479267">
-    <w:abstractNumId w:val="3"/>
-  </w:num>
-  <w:num w:numId="5" w16cid:durableId="648442138">
-    <w:abstractNumId w:val="5"/>
-  </w:num>
-  <w:num w:numId="6" w16cid:durableId="666519724">
-    <w:abstractNumId w:val="2"/>
+  <w:num w:numId="8" w16cid:durableId="886337672">
+    <w:abstractNumId w:val="0"/>
   </w:num>
 </w:numbering>
 </file>
@@ -2700,6 +3226,163 @@
       </w:rPr>
     </w:tblStylePr>
   </w:style>
+  <w:style w:type="paragraph" w:styleId="ListBullet">
+    <w:name w:val="List Bullet"/>
+    <w:basedOn w:val="Normal"/>
+    <w:uiPriority w:val="99"/>
+    <w:unhideWhenUsed/>
+    <w:rsid w:val="000A2FFE"/>
+    <w:pPr>
+      <w:numPr>
+        <w:numId w:val="7"/>
+      </w:numPr>
+      <w:tabs>
+        <w:tab w:val="clear" w:pos="360"/>
+      </w:tabs>
+      <w:spacing w:after="200" w:line="276" w:lineRule="auto"/>
+      <w:contextualSpacing/>
+    </w:pPr>
+    <w:rPr>
+      <w:rFonts w:eastAsia="MS Mincho"/>
+      <w:kern w:val="0"/>
+      <w:sz w:val="22"/>
+      <w:szCs w:val="22"/>
+      <w14:ligatures w14:val="none"/>
+    </w:rPr>
+  </w:style>
+  <w:style w:type="table" w:customStyle="1" w:styleId="TableGrid1">
+    <w:name w:val="Table Grid1"/>
+    <w:basedOn w:val="TableNormal"/>
+    <w:next w:val="TableGrid"/>
+    <w:uiPriority w:val="59"/>
+    <w:rsid w:val="000A2FFE"/>
+    <w:pPr>
+      <w:spacing w:after="0" w:line="240" w:lineRule="auto"/>
+    </w:pPr>
+    <w:rPr>
+      <w:rFonts w:eastAsia="MS Mincho"/>
+      <w:kern w:val="0"/>
+      <w:sz w:val="22"/>
+      <w:szCs w:val="22"/>
+      <w14:ligatures w14:val="none"/>
+    </w:rPr>
+    <w:tblPr>
+      <w:tblBorders>
+        <w:top w:val="single" w:sz="4" w:space="0" w:color="auto"/>
+        <w:left w:val="single" w:sz="4" w:space="0" w:color="auto"/>
+        <w:bottom w:val="single" w:sz="4" w:space="0" w:color="auto"/>
+        <w:right w:val="single" w:sz="4" w:space="0" w:color="auto"/>
+        <w:insideH w:val="single" w:sz="4" w:space="0" w:color="auto"/>
+        <w:insideV w:val="single" w:sz="4" w:space="0" w:color="auto"/>
+      </w:tblBorders>
+    </w:tblPr>
+  </w:style>
+  <w:style w:type="paragraph" w:styleId="ListBullet2">
+    <w:name w:val="List Bullet 2"/>
+    <w:basedOn w:val="Normal"/>
+    <w:uiPriority w:val="99"/>
+    <w:unhideWhenUsed/>
+    <w:rsid w:val="000A2FFE"/>
+    <w:pPr>
+      <w:numPr>
+        <w:numId w:val="8"/>
+      </w:numPr>
+      <w:tabs>
+        <w:tab w:val="clear" w:pos="720"/>
+      </w:tabs>
+      <w:spacing w:after="200" w:line="276" w:lineRule="auto"/>
+      <w:ind w:left="0" w:firstLine="0"/>
+      <w:contextualSpacing/>
+    </w:pPr>
+    <w:rPr>
+      <w:rFonts w:eastAsia="MS Mincho"/>
+      <w:kern w:val="0"/>
+      <w:sz w:val="22"/>
+      <w:szCs w:val="22"/>
+      <w14:ligatures w14:val="none"/>
+    </w:rPr>
+  </w:style>
+  <w:style w:type="table" w:customStyle="1" w:styleId="TableGrid2">
+    <w:name w:val="Table Grid2"/>
+    <w:basedOn w:val="TableNormal"/>
+    <w:next w:val="TableGrid"/>
+    <w:uiPriority w:val="59"/>
+    <w:rsid w:val="000A2FFE"/>
+    <w:pPr>
+      <w:spacing w:after="0" w:line="240" w:lineRule="auto"/>
+    </w:pPr>
+    <w:rPr>
+      <w:rFonts w:eastAsia="MS Mincho"/>
+      <w:kern w:val="0"/>
+      <w:sz w:val="22"/>
+      <w:szCs w:val="22"/>
+      <w14:ligatures w14:val="none"/>
+    </w:rPr>
+    <w:tblPr>
+      <w:tblBorders>
+        <w:top w:val="single" w:sz="4" w:space="0" w:color="auto"/>
+        <w:left w:val="single" w:sz="4" w:space="0" w:color="auto"/>
+        <w:bottom w:val="single" w:sz="4" w:space="0" w:color="auto"/>
+        <w:right w:val="single" w:sz="4" w:space="0" w:color="auto"/>
+        <w:insideH w:val="single" w:sz="4" w:space="0" w:color="auto"/>
+        <w:insideV w:val="single" w:sz="4" w:space="0" w:color="auto"/>
+      </w:tblBorders>
+    </w:tblPr>
+  </w:style>
+  <w:style w:type="table" w:customStyle="1" w:styleId="TableGrid3">
+    <w:name w:val="Table Grid3"/>
+    <w:basedOn w:val="TableNormal"/>
+    <w:next w:val="TableGrid"/>
+    <w:uiPriority w:val="59"/>
+    <w:rsid w:val="000A2FFE"/>
+    <w:pPr>
+      <w:spacing w:after="0" w:line="240" w:lineRule="auto"/>
+    </w:pPr>
+    <w:rPr>
+      <w:rFonts w:eastAsia="MS Mincho"/>
+      <w:kern w:val="0"/>
+      <w:sz w:val="22"/>
+      <w:szCs w:val="22"/>
+      <w14:ligatures w14:val="none"/>
+    </w:rPr>
+    <w:tblPr>
+      <w:tblBorders>
+        <w:top w:val="single" w:sz="4" w:space="0" w:color="auto"/>
+        <w:left w:val="single" w:sz="4" w:space="0" w:color="auto"/>
+        <w:bottom w:val="single" w:sz="4" w:space="0" w:color="auto"/>
+        <w:right w:val="single" w:sz="4" w:space="0" w:color="auto"/>
+        <w:insideH w:val="single" w:sz="4" w:space="0" w:color="auto"/>
+        <w:insideV w:val="single" w:sz="4" w:space="0" w:color="auto"/>
+      </w:tblBorders>
+    </w:tblPr>
+  </w:style>
+  <w:style w:type="table" w:customStyle="1" w:styleId="TableGrid4">
+    <w:name w:val="Table Grid4"/>
+    <w:basedOn w:val="TableNormal"/>
+    <w:next w:val="TableGrid"/>
+    <w:uiPriority w:val="59"/>
+    <w:rsid w:val="000A2FFE"/>
+    <w:pPr>
+      <w:spacing w:after="0" w:line="240" w:lineRule="auto"/>
+    </w:pPr>
+    <w:rPr>
+      <w:rFonts w:eastAsia="MS Mincho"/>
+      <w:kern w:val="0"/>
+      <w:sz w:val="22"/>
+      <w:szCs w:val="22"/>
+      <w14:ligatures w14:val="none"/>
+    </w:rPr>
+    <w:tblPr>
+      <w:tblBorders>
+        <w:top w:val="single" w:sz="4" w:space="0" w:color="auto"/>
+        <w:left w:val="single" w:sz="4" w:space="0" w:color="auto"/>
+        <w:bottom w:val="single" w:sz="4" w:space="0" w:color="auto"/>
+        <w:right w:val="single" w:sz="4" w:space="0" w:color="auto"/>
+        <w:insideH w:val="single" w:sz="4" w:space="0" w:color="auto"/>
+        <w:insideV w:val="single" w:sz="4" w:space="0" w:color="auto"/>
+      </w:tblBorders>
+    </w:tblPr>
+  </w:style>
 </w:styles>
 </file>
 

</xml_diff>

<commit_message>
fix(docx): isolate list state in table cells (#3294)
* fix(docx): isolate list state in table cells

Lists with the same numId in different table cells were incorrectly
merged. Added context manager to isolate list state during cell
processing. Includes test cases and updated ground truth files.

Signed-off-by: Cesar Berrospi Ramis <ceb@zurich.ibm.com>

* style(docx): modernize type hints to use PEP 604 union syntax

Signed-off-by: Cesar Berrospi Ramis <ceb@zurich.ibm.com>

---------

Signed-off-by: Cesar Berrospi Ramis <ceb@zurich.ibm.com>
Signed-off-by: OrbisAI Security <mediratta01.pally@gmail.com>
</commit_message>
<xml_diff>
--- a/tests/data/docx/docx_rich_cells.docx
+++ b/tests/data/docx/docx_rich_cells.docx
@@ -318,23 +318,12 @@
         </w:tc>
       </w:tr>
     </w:tbl>
-    <w:p/>
-    <w:p/>
-    <w:p/>
-    <w:p/>
-    <w:p/>
     <w:p>
       <w:pPr>
         <w:tabs>
           <w:tab w:val="left" w:pos="2612"/>
         </w:tabs>
       </w:pPr>
-      <w:r>
-        <w:tab/>
-      </w:r>
-      <w:r>
-        <w:br w:type="textWrapping" w:clear="all"/>
-      </w:r>
     </w:p>
     <w:p>
       <w:pPr>
@@ -990,6 +979,495 @@
       </w:tr>
     </w:tbl>
     <w:p/>
+    <w:p>
+      <w:pPr>
+        <w:pStyle w:val="Heading2"/>
+      </w:pPr>
+      <w:r>
+        <w:lastRenderedPageBreak/>
+        <w:t>Lists with s</w:t>
+      </w:r>
+      <w:r>
+        <w:t xml:space="preserve">ame </w:t>
+      </w:r>
+      <w:proofErr w:type="spellStart"/>
+      <w:r>
+        <w:t>numId</w:t>
+      </w:r>
+      <w:proofErr w:type="spellEnd"/>
+      <w:r>
+        <w:t xml:space="preserve"> in different cells</w:t>
+      </w:r>
+    </w:p>
+    <w:p/>
+    <w:tbl>
+      <w:tblPr>
+        <w:tblStyle w:val="TableGrid1"/>
+        <w:tblW w:w="0" w:type="auto"/>
+        <w:tblLook w:val="04A0" w:firstRow="1" w:lastRow="0" w:firstColumn="1" w:lastColumn="0" w:noHBand="0" w:noVBand="1"/>
+      </w:tblPr>
+      <w:tblGrid>
+        <w:gridCol w:w="8640"/>
+      </w:tblGrid>
+      <w:tr>
+        <w:tc>
+          <w:tcPr>
+            <w:tcW w:w="8640" w:type="dxa"/>
+          </w:tcPr>
+          <w:p>
+            <w:pPr>
+              <w:numPr>
+                <w:ilvl w:val="0"/>
+                <w:numId w:val="7"/>
+              </w:numPr>
+              <w:rPr>
+                <w:rFonts w:ascii="Cambria" w:hAnsi="Cambria" w:cs="Times New Roman"/>
+              </w:rPr>
+            </w:pPr>
+            <w:r>
+              <w:rPr>
+                <w:rFonts w:ascii="Cambria" w:hAnsi="Cambria" w:cs="Times New Roman"/>
+              </w:rPr>
+              <w:t>Cell 1 item 1</w:t>
+            </w:r>
+          </w:p>
+          <w:p>
+            <w:pPr>
+              <w:numPr>
+                <w:ilvl w:val="0"/>
+                <w:numId w:val="7"/>
+              </w:numPr>
+              <w:rPr>
+                <w:rFonts w:ascii="Cambria" w:hAnsi="Cambria" w:cs="Times New Roman"/>
+              </w:rPr>
+            </w:pPr>
+            <w:r>
+              <w:rPr>
+                <w:rFonts w:ascii="Cambria" w:hAnsi="Cambria" w:cs="Times New Roman"/>
+              </w:rPr>
+              <w:t>Cell 1 item 2</w:t>
+            </w:r>
+          </w:p>
+        </w:tc>
+      </w:tr>
+      <w:tr>
+        <w:tc>
+          <w:tcPr>
+            <w:tcW w:w="8640" w:type="dxa"/>
+          </w:tcPr>
+          <w:p>
+            <w:pPr>
+              <w:numPr>
+                <w:ilvl w:val="0"/>
+                <w:numId w:val="7"/>
+              </w:numPr>
+              <w:rPr>
+                <w:rFonts w:ascii="Cambria" w:hAnsi="Cambria" w:cs="Times New Roman"/>
+              </w:rPr>
+            </w:pPr>
+            <w:r>
+              <w:rPr>
+                <w:rFonts w:ascii="Cambria" w:hAnsi="Cambria" w:cs="Times New Roman"/>
+              </w:rPr>
+              <w:t>Cell 2 item 1</w:t>
+            </w:r>
+          </w:p>
+          <w:p>
+            <w:pPr>
+              <w:numPr>
+                <w:ilvl w:val="0"/>
+                <w:numId w:val="7"/>
+              </w:numPr>
+              <w:rPr>
+                <w:rFonts w:ascii="Cambria" w:hAnsi="Cambria" w:cs="Times New Roman"/>
+              </w:rPr>
+            </w:pPr>
+            <w:r>
+              <w:rPr>
+                <w:rFonts w:ascii="Cambria" w:hAnsi="Cambria" w:cs="Times New Roman"/>
+              </w:rPr>
+              <w:t>Cell 2 item 2</w:t>
+            </w:r>
+          </w:p>
+        </w:tc>
+      </w:tr>
+    </w:tbl>
+    <w:p/>
+    <w:p>
+      <w:pPr>
+        <w:pStyle w:val="Heading2"/>
+      </w:pPr>
+      <w:r>
+        <w:t>Lists with d</w:t>
+      </w:r>
+      <w:r>
+        <w:t xml:space="preserve">ifferent </w:t>
+      </w:r>
+      <w:proofErr w:type="spellStart"/>
+      <w:r>
+        <w:t>numIds</w:t>
+      </w:r>
+      <w:proofErr w:type="spellEnd"/>
+      <w:r>
+        <w:t xml:space="preserve"> in different cells</w:t>
+      </w:r>
+    </w:p>
+    <w:p/>
+    <w:tbl>
+      <w:tblPr>
+        <w:tblStyle w:val="TableGrid2"/>
+        <w:tblW w:w="0" w:type="auto"/>
+        <w:tblLook w:val="04A0" w:firstRow="1" w:lastRow="0" w:firstColumn="1" w:lastColumn="0" w:noHBand="0" w:noVBand="1"/>
+      </w:tblPr>
+      <w:tblGrid>
+        <w:gridCol w:w="8640"/>
+      </w:tblGrid>
+      <w:tr>
+        <w:tc>
+          <w:tcPr>
+            <w:tcW w:w="8640" w:type="dxa"/>
+          </w:tcPr>
+          <w:p>
+            <w:pPr>
+              <w:numPr>
+                <w:ilvl w:val="0"/>
+                <w:numId w:val="7"/>
+              </w:numPr>
+              <w:rPr>
+                <w:rFonts w:ascii="Cambria" w:hAnsi="Cambria" w:cs="Times New Roman"/>
+              </w:rPr>
+            </w:pPr>
+            <w:r>
+              <w:rPr>
+                <w:rFonts w:ascii="Cambria" w:hAnsi="Cambria" w:cs="Times New Roman"/>
+              </w:rPr>
+              <w:t>Cell 1 item 1</w:t>
+            </w:r>
+          </w:p>
+          <w:p>
+            <w:pPr>
+              <w:numPr>
+                <w:ilvl w:val="0"/>
+                <w:numId w:val="7"/>
+              </w:numPr>
+              <w:rPr>
+                <w:rFonts w:ascii="Cambria" w:hAnsi="Cambria" w:cs="Times New Roman"/>
+              </w:rPr>
+            </w:pPr>
+            <w:r>
+              <w:rPr>
+                <w:rFonts w:ascii="Cambria" w:hAnsi="Cambria" w:cs="Times New Roman"/>
+              </w:rPr>
+              <w:t>Cell 1 item 2</w:t>
+            </w:r>
+          </w:p>
+        </w:tc>
+      </w:tr>
+      <w:tr>
+        <w:tc>
+          <w:tcPr>
+            <w:tcW w:w="8640" w:type="dxa"/>
+          </w:tcPr>
+          <w:p>
+            <w:pPr>
+              <w:numPr>
+                <w:ilvl w:val="0"/>
+                <w:numId w:val="8"/>
+              </w:numPr>
+              <w:rPr>
+                <w:rFonts w:ascii="Cambria" w:hAnsi="Cambria" w:cs="Times New Roman"/>
+              </w:rPr>
+            </w:pPr>
+            <w:r>
+              <w:rPr>
+                <w:rFonts w:ascii="Cambria" w:hAnsi="Cambria" w:cs="Times New Roman"/>
+              </w:rPr>
+              <w:t>Cell 2 item 1</w:t>
+            </w:r>
+          </w:p>
+          <w:p>
+            <w:pPr>
+              <w:numPr>
+                <w:ilvl w:val="0"/>
+                <w:numId w:val="8"/>
+              </w:numPr>
+              <w:rPr>
+                <w:rFonts w:ascii="Cambria" w:hAnsi="Cambria" w:cs="Times New Roman"/>
+              </w:rPr>
+            </w:pPr>
+            <w:r>
+              <w:rPr>
+                <w:rFonts w:ascii="Cambria" w:hAnsi="Cambria" w:cs="Times New Roman"/>
+              </w:rPr>
+              <w:t>Cell 2 item 2</w:t>
+            </w:r>
+          </w:p>
+        </w:tc>
+      </w:tr>
+    </w:tbl>
+    <w:p/>
+    <w:p>
+      <w:pPr>
+        <w:pStyle w:val="Heading2"/>
+      </w:pPr>
+      <w:r>
+        <w:t>Multiple columns with lists</w:t>
+      </w:r>
+    </w:p>
+    <w:p/>
+    <w:tbl>
+      <w:tblPr>
+        <w:tblStyle w:val="TableGrid3"/>
+        <w:tblW w:w="0" w:type="auto"/>
+        <w:tblLook w:val="04A0" w:firstRow="1" w:lastRow="0" w:firstColumn="1" w:lastColumn="0" w:noHBand="0" w:noVBand="1"/>
+      </w:tblPr>
+      <w:tblGrid>
+        <w:gridCol w:w="4320"/>
+        <w:gridCol w:w="4320"/>
+      </w:tblGrid>
+      <w:tr>
+        <w:tc>
+          <w:tcPr>
+            <w:tcW w:w="4320" w:type="dxa"/>
+          </w:tcPr>
+          <w:p>
+            <w:pPr>
+              <w:numPr>
+                <w:ilvl w:val="0"/>
+                <w:numId w:val="7"/>
+              </w:numPr>
+              <w:rPr>
+                <w:rFonts w:ascii="Cambria" w:hAnsi="Cambria" w:cs="Times New Roman"/>
+              </w:rPr>
+            </w:pPr>
+            <w:r>
+              <w:rPr>
+                <w:rFonts w:ascii="Cambria" w:hAnsi="Cambria" w:cs="Times New Roman"/>
+              </w:rPr>
+              <w:t>R1C1 item 1</w:t>
+            </w:r>
+          </w:p>
+          <w:p>
+            <w:pPr>
+              <w:numPr>
+                <w:ilvl w:val="0"/>
+                <w:numId w:val="7"/>
+              </w:numPr>
+              <w:rPr>
+                <w:rFonts w:ascii="Cambria" w:hAnsi="Cambria" w:cs="Times New Roman"/>
+              </w:rPr>
+            </w:pPr>
+            <w:r>
+              <w:rPr>
+                <w:rFonts w:ascii="Cambria" w:hAnsi="Cambria" w:cs="Times New Roman"/>
+              </w:rPr>
+              <w:t>R1C1 item 2</w:t>
+            </w:r>
+          </w:p>
+        </w:tc>
+        <w:tc>
+          <w:tcPr>
+            <w:tcW w:w="4320" w:type="dxa"/>
+          </w:tcPr>
+          <w:p>
+            <w:pPr>
+              <w:numPr>
+                <w:ilvl w:val="0"/>
+                <w:numId w:val="7"/>
+              </w:numPr>
+              <w:rPr>
+                <w:rFonts w:ascii="Cambria" w:hAnsi="Cambria" w:cs="Times New Roman"/>
+              </w:rPr>
+            </w:pPr>
+            <w:r>
+              <w:rPr>
+                <w:rFonts w:ascii="Cambria" w:hAnsi="Cambria" w:cs="Times New Roman"/>
+              </w:rPr>
+              <w:t>R1C2 item 1</w:t>
+            </w:r>
+          </w:p>
+          <w:p>
+            <w:pPr>
+              <w:numPr>
+                <w:ilvl w:val="0"/>
+                <w:numId w:val="7"/>
+              </w:numPr>
+              <w:rPr>
+                <w:rFonts w:ascii="Cambria" w:hAnsi="Cambria" w:cs="Times New Roman"/>
+              </w:rPr>
+            </w:pPr>
+            <w:r>
+              <w:rPr>
+                <w:rFonts w:ascii="Cambria" w:hAnsi="Cambria" w:cs="Times New Roman"/>
+              </w:rPr>
+              <w:t>R1C2 item 2</w:t>
+            </w:r>
+          </w:p>
+        </w:tc>
+      </w:tr>
+      <w:tr>
+        <w:tc>
+          <w:tcPr>
+            <w:tcW w:w="4320" w:type="dxa"/>
+          </w:tcPr>
+          <w:p>
+            <w:pPr>
+              <w:numPr>
+                <w:ilvl w:val="0"/>
+                <w:numId w:val="7"/>
+              </w:numPr>
+              <w:rPr>
+                <w:rFonts w:ascii="Cambria" w:hAnsi="Cambria" w:cs="Times New Roman"/>
+              </w:rPr>
+            </w:pPr>
+            <w:r>
+              <w:rPr>
+                <w:rFonts w:ascii="Cambria" w:hAnsi="Cambria" w:cs="Times New Roman"/>
+              </w:rPr>
+              <w:t>R2C1 item 1</w:t>
+            </w:r>
+          </w:p>
+          <w:p>
+            <w:pPr>
+              <w:numPr>
+                <w:ilvl w:val="0"/>
+                <w:numId w:val="7"/>
+              </w:numPr>
+              <w:rPr>
+                <w:rFonts w:ascii="Cambria" w:hAnsi="Cambria" w:cs="Times New Roman"/>
+              </w:rPr>
+            </w:pPr>
+            <w:r>
+              <w:rPr>
+                <w:rFonts w:ascii="Cambria" w:hAnsi="Cambria" w:cs="Times New Roman"/>
+              </w:rPr>
+              <w:t>R2C1 item 2</w:t>
+            </w:r>
+          </w:p>
+        </w:tc>
+        <w:tc>
+          <w:tcPr>
+            <w:tcW w:w="4320" w:type="dxa"/>
+          </w:tcPr>
+          <w:p>
+            <w:pPr>
+              <w:numPr>
+                <w:ilvl w:val="0"/>
+                <w:numId w:val="7"/>
+              </w:numPr>
+              <w:rPr>
+                <w:rFonts w:ascii="Cambria" w:hAnsi="Cambria" w:cs="Times New Roman"/>
+              </w:rPr>
+            </w:pPr>
+            <w:r>
+              <w:rPr>
+                <w:rFonts w:ascii="Cambria" w:hAnsi="Cambria" w:cs="Times New Roman"/>
+              </w:rPr>
+              <w:t>R2C2 item 1</w:t>
+            </w:r>
+          </w:p>
+          <w:p>
+            <w:pPr>
+              <w:numPr>
+                <w:ilvl w:val="0"/>
+                <w:numId w:val="7"/>
+              </w:numPr>
+              <w:rPr>
+                <w:rFonts w:ascii="Cambria" w:hAnsi="Cambria" w:cs="Times New Roman"/>
+              </w:rPr>
+            </w:pPr>
+            <w:r>
+              <w:rPr>
+                <w:rFonts w:ascii="Cambria" w:hAnsi="Cambria" w:cs="Times New Roman"/>
+              </w:rPr>
+              <w:t>R2C2 item 2</w:t>
+            </w:r>
+          </w:p>
+        </w:tc>
+      </w:tr>
+    </w:tbl>
+    <w:p/>
+    <w:p>
+      <w:pPr>
+        <w:pStyle w:val="Heading2"/>
+      </w:pPr>
+      <w:r>
+        <w:t>Mixed content - list and regular text in different cells</w:t>
+      </w:r>
+    </w:p>
+    <w:p/>
+    <w:tbl>
+      <w:tblPr>
+        <w:tblStyle w:val="TableGrid4"/>
+        <w:tblW w:w="0" w:type="auto"/>
+        <w:tblLook w:val="04A0" w:firstRow="1" w:lastRow="0" w:firstColumn="1" w:lastColumn="0" w:noHBand="0" w:noVBand="1"/>
+      </w:tblPr>
+      <w:tblGrid>
+        <w:gridCol w:w="8640"/>
+      </w:tblGrid>
+      <w:tr>
+        <w:tc>
+          <w:tcPr>
+            <w:tcW w:w="8640" w:type="dxa"/>
+          </w:tcPr>
+          <w:p>
+            <w:pPr>
+              <w:numPr>
+                <w:ilvl w:val="0"/>
+                <w:numId w:val="7"/>
+              </w:numPr>
+              <w:rPr>
+                <w:rFonts w:ascii="Cambria" w:hAnsi="Cambria" w:cs="Times New Roman"/>
+              </w:rPr>
+            </w:pPr>
+            <w:r>
+              <w:rPr>
+                <w:rFonts w:ascii="Cambria" w:hAnsi="Cambria" w:cs="Times New Roman"/>
+              </w:rPr>
+              <w:t>List item 1</w:t>
+            </w:r>
+          </w:p>
+          <w:p>
+            <w:pPr>
+              <w:numPr>
+                <w:ilvl w:val="0"/>
+                <w:numId w:val="7"/>
+              </w:numPr>
+              <w:rPr>
+                <w:rFonts w:ascii="Cambria" w:hAnsi="Cambria" w:cs="Times New Roman"/>
+              </w:rPr>
+            </w:pPr>
+            <w:r>
+              <w:rPr>
+                <w:rFonts w:ascii="Cambria" w:hAnsi="Cambria" w:cs="Times New Roman"/>
+              </w:rPr>
+              <w:t>List item 2</w:t>
+            </w:r>
+          </w:p>
+        </w:tc>
+      </w:tr>
+      <w:tr>
+        <w:tc>
+          <w:tcPr>
+            <w:tcW w:w="8640" w:type="dxa"/>
+          </w:tcPr>
+          <w:p>
+            <w:pPr>
+              <w:rPr>
+                <w:rFonts w:ascii="Cambria" w:hAnsi="Cambria" w:cs="Times New Roman"/>
+              </w:rPr>
+            </w:pPr>
+            <w:r>
+              <w:rPr>
+                <w:rFonts w:ascii="Cambria" w:hAnsi="Cambria" w:cs="Times New Roman"/>
+              </w:rPr>
+              <w:t>Regular text in second cell</w:t>
+            </w:r>
+          </w:p>
+        </w:tc>
+      </w:tr>
+    </w:tbl>
+    <w:p/>
     <w:sectPr>
       <w:pgSz w:w="12240" w:h="15840"/>
       <w:pgMar w:top="1440" w:right="1440" w:bottom="1440" w:left="1440" w:header="720" w:footer="720" w:gutter="0"/>
@@ -1003,6 +1481,48 @@
 <file path=word/numbering.xml><?xml version="1.0" encoding="utf-8"?>
 <w:numbering xmlns:wpc="http://schemas.microsoft.com/office/word/2010/wordprocessingCanvas" xmlns:cx="http://schemas.microsoft.com/office/drawing/2014/chartex" xmlns:cx1="http://schemas.microsoft.com/office/drawing/2015/9/8/chartex" xmlns:cx2="http://schemas.microsoft.com/office/drawing/2015/10/21/chartex" xmlns:cx3="http://schemas.microsoft.com/office/drawing/2016/5/9/chartex" xmlns:cx4="http://schemas.microsoft.com/office/drawing/2016/5/10/chartex" xmlns:cx5="http://schemas.microsoft.com/office/drawing/2016/5/11/chartex" xmlns:cx6="http://schemas.microsoft.com/office/drawing/2016/5/12/chartex" xmlns:cx7="http://schemas.microsoft.com/office/drawing/2016/5/13/chartex" xmlns:cx8="http://schemas.microsoft.com/office/drawing/2016/5/14/chartex" xmlns:mc="http://schemas.openxmlformats.org/markup-compatibility/2006" xmlns:aink="http://schemas.microsoft.com/office/drawing/2016/ink" xmlns:am3d="http://schemas.microsoft.com/office/drawing/2017/model3d" xmlns:o="urn:schemas-microsoft-com:office:office" xmlns:oel="http://schemas.microsoft.com/office/2019/extlst" xmlns:r="http://schemas.openxmlformats.org/officeDocument/2006/relationships" xmlns:m="http://schemas.openxmlformats.org/officeDocument/2006/math" xmlns:v="urn:schemas-microsoft-com:vml" xmlns:wp14="http://schemas.microsoft.com/office/word/2010/wordprocessingDrawing" xmlns:wp="http://schemas.openxmlformats.org/drawingml/2006/wordprocessingDrawing" xmlns:w10="urn:schemas-microsoft-com:office:word" xmlns:w="http://schemas.openxmlformats.org/wordprocessingml/2006/main" xmlns:w14="http://schemas.microsoft.com/office/word/2010/wordml" xmlns:w15="http://schemas.microsoft.com/office/word/2012/wordml" xmlns:w16cex="http://schemas.microsoft.com/office/word/2018/wordml/cex" xmlns:w16cid="http://schemas.microsoft.com/office/word/2016/wordml/cid" xmlns:w16="http://schemas.microsoft.com/office/word/2018/wordml" xmlns:w16du="http://schemas.microsoft.com/office/word/2023/wordml/word16du" xmlns:w16sdtdh="http://schemas.microsoft.com/office/word/2020/wordml/sdtdatahash" xmlns:w16sdtfl="http://schemas.microsoft.com/office/word/2024/wordml/sdtformatlock" xmlns:w16se="http://schemas.microsoft.com/office/word/2015/wordml/symex" xmlns:wpg="http://schemas.microsoft.com/office/word/2010/wordprocessingGroup" xmlns:wpi="http://schemas.microsoft.com/office/word/2010/wordprocessingInk" xmlns:wne="http://schemas.microsoft.com/office/word/2006/wordml" xmlns:wps="http://schemas.microsoft.com/office/word/2010/wordprocessingShape" mc:Ignorable="w14 w15 w16se w16cid w16 w16cex w16sdtdh w16sdtfl w16du wp14">
   <w:abstractNum w:abstractNumId="0" w15:restartNumberingAfterBreak="0">
+    <w:nsid w:val="FFFFFF83"/>
+    <w:multiLevelType w:val="singleLevel"/>
+    <w:tmpl w:val="3D1EFFD4"/>
+    <w:lvl w:ilvl="0">
+      <w:start w:val="1"/>
+      <w:numFmt w:val="bullet"/>
+      <w:pStyle w:val="ListBullet2"/>
+      <w:lvlText w:val=""/>
+      <w:lvlJc w:val="left"/>
+      <w:pPr>
+        <w:tabs>
+          <w:tab w:val="num" w:pos="720"/>
+        </w:tabs>
+        <w:ind w:left="720" w:hanging="360"/>
+      </w:pPr>
+      <w:rPr>
+        <w:rFonts w:ascii="Symbol" w:hAnsi="Symbol" w:hint="default"/>
+      </w:rPr>
+    </w:lvl>
+  </w:abstractNum>
+  <w:abstractNum w:abstractNumId="1" w15:restartNumberingAfterBreak="0">
+    <w:nsid w:val="FFFFFF89"/>
+    <w:multiLevelType w:val="singleLevel"/>
+    <w:tmpl w:val="29761A62"/>
+    <w:lvl w:ilvl="0">
+      <w:start w:val="1"/>
+      <w:numFmt w:val="bullet"/>
+      <w:pStyle w:val="ListBullet"/>
+      <w:lvlText w:val=""/>
+      <w:lvlJc w:val="left"/>
+      <w:pPr>
+        <w:tabs>
+          <w:tab w:val="num" w:pos="360"/>
+        </w:tabs>
+        <w:ind w:left="360" w:hanging="360"/>
+      </w:pPr>
+      <w:rPr>
+        <w:rFonts w:ascii="Symbol" w:hAnsi="Symbol" w:hint="default"/>
+      </w:rPr>
+    </w:lvl>
+  </w:abstractNum>
+  <w:abstractNum w:abstractNumId="2" w15:restartNumberingAfterBreak="0">
     <w:nsid w:val="2731336A"/>
     <w:multiLevelType w:val="hybridMultilevel"/>
     <w:tmpl w:val="2F427A9C"/>
@@ -1115,7 +1635,7 @@
       </w:rPr>
     </w:lvl>
   </w:abstractNum>
-  <w:abstractNum w:abstractNumId="1" w15:restartNumberingAfterBreak="0">
+  <w:abstractNum w:abstractNumId="3" w15:restartNumberingAfterBreak="0">
     <w:nsid w:val="2814478C"/>
     <w:multiLevelType w:val="hybridMultilevel"/>
     <w:tmpl w:val="0EECB94C"/>
@@ -1227,7 +1747,7 @@
       </w:rPr>
     </w:lvl>
   </w:abstractNum>
-  <w:abstractNum w:abstractNumId="2" w15:restartNumberingAfterBreak="0">
+  <w:abstractNum w:abstractNumId="4" w15:restartNumberingAfterBreak="0">
     <w:nsid w:val="358E4FCC"/>
     <w:multiLevelType w:val="hybridMultilevel"/>
     <w:tmpl w:val="2A8EE3D0"/>
@@ -1313,7 +1833,7 @@
       </w:pPr>
     </w:lvl>
   </w:abstractNum>
-  <w:abstractNum w:abstractNumId="3" w15:restartNumberingAfterBreak="0">
+  <w:abstractNum w:abstractNumId="5" w15:restartNumberingAfterBreak="0">
     <w:nsid w:val="37E45C6F"/>
     <w:multiLevelType w:val="hybridMultilevel"/>
     <w:tmpl w:val="BE707958"/>
@@ -1399,7 +1919,7 @@
       </w:pPr>
     </w:lvl>
   </w:abstractNum>
-  <w:abstractNum w:abstractNumId="4" w15:restartNumberingAfterBreak="0">
+  <w:abstractNum w:abstractNumId="6" w15:restartNumberingAfterBreak="0">
     <w:nsid w:val="408B516F"/>
     <w:multiLevelType w:val="hybridMultilevel"/>
     <w:tmpl w:val="9482EBC8"/>
@@ -1512,7 +2032,7 @@
       </w:rPr>
     </w:lvl>
   </w:abstractNum>
-  <w:abstractNum w:abstractNumId="5" w15:restartNumberingAfterBreak="0">
+  <w:abstractNum w:abstractNumId="7" w15:restartNumberingAfterBreak="0">
     <w:nsid w:val="51AC0023"/>
     <w:multiLevelType w:val="hybridMultilevel"/>
     <w:tmpl w:val="FD2AF1FA"/>
@@ -1626,22 +2146,28 @@
     </w:lvl>
   </w:abstractNum>
   <w:num w:numId="1" w16cid:durableId="971406578">
-    <w:abstractNumId w:val="0"/>
+    <w:abstractNumId w:val="2"/>
   </w:num>
   <w:num w:numId="2" w16cid:durableId="1254313279">
+    <w:abstractNumId w:val="3"/>
+  </w:num>
+  <w:num w:numId="3" w16cid:durableId="926963222">
+    <w:abstractNumId w:val="6"/>
+  </w:num>
+  <w:num w:numId="4" w16cid:durableId="308479267">
+    <w:abstractNumId w:val="5"/>
+  </w:num>
+  <w:num w:numId="5" w16cid:durableId="648442138">
+    <w:abstractNumId w:val="7"/>
+  </w:num>
+  <w:num w:numId="6" w16cid:durableId="666519724">
+    <w:abstractNumId w:val="4"/>
+  </w:num>
+  <w:num w:numId="7" w16cid:durableId="563956353">
     <w:abstractNumId w:val="1"/>
   </w:num>
-  <w:num w:numId="3" w16cid:durableId="926963222">
-    <w:abstractNumId w:val="4"/>
-  </w:num>
-  <w:num w:numId="4" w16cid:durableId="308479267">
-    <w:abstractNumId w:val="3"/>
-  </w:num>
-  <w:num w:numId="5" w16cid:durableId="648442138">
-    <w:abstractNumId w:val="5"/>
-  </w:num>
-  <w:num w:numId="6" w16cid:durableId="666519724">
-    <w:abstractNumId w:val="2"/>
+  <w:num w:numId="8" w16cid:durableId="886337672">
+    <w:abstractNumId w:val="0"/>
   </w:num>
 </w:numbering>
 </file>
@@ -2700,6 +3226,163 @@
       </w:rPr>
     </w:tblStylePr>
   </w:style>
+  <w:style w:type="paragraph" w:styleId="ListBullet">
+    <w:name w:val="List Bullet"/>
+    <w:basedOn w:val="Normal"/>
+    <w:uiPriority w:val="99"/>
+    <w:unhideWhenUsed/>
+    <w:rsid w:val="000A2FFE"/>
+    <w:pPr>
+      <w:numPr>
+        <w:numId w:val="7"/>
+      </w:numPr>
+      <w:tabs>
+        <w:tab w:val="clear" w:pos="360"/>
+      </w:tabs>
+      <w:spacing w:after="200" w:line="276" w:lineRule="auto"/>
+      <w:contextualSpacing/>
+    </w:pPr>
+    <w:rPr>
+      <w:rFonts w:eastAsia="MS Mincho"/>
+      <w:kern w:val="0"/>
+      <w:sz w:val="22"/>
+      <w:szCs w:val="22"/>
+      <w14:ligatures w14:val="none"/>
+    </w:rPr>
+  </w:style>
+  <w:style w:type="table" w:customStyle="1" w:styleId="TableGrid1">
+    <w:name w:val="Table Grid1"/>
+    <w:basedOn w:val="TableNormal"/>
+    <w:next w:val="TableGrid"/>
+    <w:uiPriority w:val="59"/>
+    <w:rsid w:val="000A2FFE"/>
+    <w:pPr>
+      <w:spacing w:after="0" w:line="240" w:lineRule="auto"/>
+    </w:pPr>
+    <w:rPr>
+      <w:rFonts w:eastAsia="MS Mincho"/>
+      <w:kern w:val="0"/>
+      <w:sz w:val="22"/>
+      <w:szCs w:val="22"/>
+      <w14:ligatures w14:val="none"/>
+    </w:rPr>
+    <w:tblPr>
+      <w:tblBorders>
+        <w:top w:val="single" w:sz="4" w:space="0" w:color="auto"/>
+        <w:left w:val="single" w:sz="4" w:space="0" w:color="auto"/>
+        <w:bottom w:val="single" w:sz="4" w:space="0" w:color="auto"/>
+        <w:right w:val="single" w:sz="4" w:space="0" w:color="auto"/>
+        <w:insideH w:val="single" w:sz="4" w:space="0" w:color="auto"/>
+        <w:insideV w:val="single" w:sz="4" w:space="0" w:color="auto"/>
+      </w:tblBorders>
+    </w:tblPr>
+  </w:style>
+  <w:style w:type="paragraph" w:styleId="ListBullet2">
+    <w:name w:val="List Bullet 2"/>
+    <w:basedOn w:val="Normal"/>
+    <w:uiPriority w:val="99"/>
+    <w:unhideWhenUsed/>
+    <w:rsid w:val="000A2FFE"/>
+    <w:pPr>
+      <w:numPr>
+        <w:numId w:val="8"/>
+      </w:numPr>
+      <w:tabs>
+        <w:tab w:val="clear" w:pos="720"/>
+      </w:tabs>
+      <w:spacing w:after="200" w:line="276" w:lineRule="auto"/>
+      <w:ind w:left="0" w:firstLine="0"/>
+      <w:contextualSpacing/>
+    </w:pPr>
+    <w:rPr>
+      <w:rFonts w:eastAsia="MS Mincho"/>
+      <w:kern w:val="0"/>
+      <w:sz w:val="22"/>
+      <w:szCs w:val="22"/>
+      <w14:ligatures w14:val="none"/>
+    </w:rPr>
+  </w:style>
+  <w:style w:type="table" w:customStyle="1" w:styleId="TableGrid2">
+    <w:name w:val="Table Grid2"/>
+    <w:basedOn w:val="TableNormal"/>
+    <w:next w:val="TableGrid"/>
+    <w:uiPriority w:val="59"/>
+    <w:rsid w:val="000A2FFE"/>
+    <w:pPr>
+      <w:spacing w:after="0" w:line="240" w:lineRule="auto"/>
+    </w:pPr>
+    <w:rPr>
+      <w:rFonts w:eastAsia="MS Mincho"/>
+      <w:kern w:val="0"/>
+      <w:sz w:val="22"/>
+      <w:szCs w:val="22"/>
+      <w14:ligatures w14:val="none"/>
+    </w:rPr>
+    <w:tblPr>
+      <w:tblBorders>
+        <w:top w:val="single" w:sz="4" w:space="0" w:color="auto"/>
+        <w:left w:val="single" w:sz="4" w:space="0" w:color="auto"/>
+        <w:bottom w:val="single" w:sz="4" w:space="0" w:color="auto"/>
+        <w:right w:val="single" w:sz="4" w:space="0" w:color="auto"/>
+        <w:insideH w:val="single" w:sz="4" w:space="0" w:color="auto"/>
+        <w:insideV w:val="single" w:sz="4" w:space="0" w:color="auto"/>
+      </w:tblBorders>
+    </w:tblPr>
+  </w:style>
+  <w:style w:type="table" w:customStyle="1" w:styleId="TableGrid3">
+    <w:name w:val="Table Grid3"/>
+    <w:basedOn w:val="TableNormal"/>
+    <w:next w:val="TableGrid"/>
+    <w:uiPriority w:val="59"/>
+    <w:rsid w:val="000A2FFE"/>
+    <w:pPr>
+      <w:spacing w:after="0" w:line="240" w:lineRule="auto"/>
+    </w:pPr>
+    <w:rPr>
+      <w:rFonts w:eastAsia="MS Mincho"/>
+      <w:kern w:val="0"/>
+      <w:sz w:val="22"/>
+      <w:szCs w:val="22"/>
+      <w14:ligatures w14:val="none"/>
+    </w:rPr>
+    <w:tblPr>
+      <w:tblBorders>
+        <w:top w:val="single" w:sz="4" w:space="0" w:color="auto"/>
+        <w:left w:val="single" w:sz="4" w:space="0" w:color="auto"/>
+        <w:bottom w:val="single" w:sz="4" w:space="0" w:color="auto"/>
+        <w:right w:val="single" w:sz="4" w:space="0" w:color="auto"/>
+        <w:insideH w:val="single" w:sz="4" w:space="0" w:color="auto"/>
+        <w:insideV w:val="single" w:sz="4" w:space="0" w:color="auto"/>
+      </w:tblBorders>
+    </w:tblPr>
+  </w:style>
+  <w:style w:type="table" w:customStyle="1" w:styleId="TableGrid4">
+    <w:name w:val="Table Grid4"/>
+    <w:basedOn w:val="TableNormal"/>
+    <w:next w:val="TableGrid"/>
+    <w:uiPriority w:val="59"/>
+    <w:rsid w:val="000A2FFE"/>
+    <w:pPr>
+      <w:spacing w:after="0" w:line="240" w:lineRule="auto"/>
+    </w:pPr>
+    <w:rPr>
+      <w:rFonts w:eastAsia="MS Mincho"/>
+      <w:kern w:val="0"/>
+      <w:sz w:val="22"/>
+      <w:szCs w:val="22"/>
+      <w14:ligatures w14:val="none"/>
+    </w:rPr>
+    <w:tblPr>
+      <w:tblBorders>
+        <w:top w:val="single" w:sz="4" w:space="0" w:color="auto"/>
+        <w:left w:val="single" w:sz="4" w:space="0" w:color="auto"/>
+        <w:bottom w:val="single" w:sz="4" w:space="0" w:color="auto"/>
+        <w:right w:val="single" w:sz="4" w:space="0" w:color="auto"/>
+        <w:insideH w:val="single" w:sz="4" w:space="0" w:color="auto"/>
+        <w:insideV w:val="single" w:sz="4" w:space="0" w:color="auto"/>
+      </w:tblBorders>
+    </w:tblPr>
+  </w:style>
 </w:styles>
 </file>
 

</xml_diff>